<commit_message>
agrego actualizaciones del tp5 poo
</commit_message>
<xml_diff>
--- a/TP4_ROMERO_ENZO..docx
+++ b/TP4_ROMERO_ENZO..docx
@@ -33,15 +33,7 @@
           <w:sz w:val="22"/>
           <w:szCs w:val="22"/>
         </w:rPr>
-        <w:t xml:space="preserve"> </w:t>
-      </w:r>
-      <w:r>
-        <w:rPr>
-          <w:rFonts w:ascii="Arial" w:hAnsi="Arial" w:cs="Arial"/>
-          <w:sz w:val="22"/>
-          <w:szCs w:val="22"/>
-        </w:rPr>
-        <w:t>DNI:41948148.</w:t>
+        <w:t xml:space="preserve"> DNI:41948148.</w:t>
       </w:r>
     </w:p>
     <w:p>
@@ -96,17 +88,7 @@
           <w:sz w:val="22"/>
           <w:szCs w:val="22"/>
         </w:rPr>
-        <w:t xml:space="preserve">Nombre </w:t>
-      </w:r>
-      <w:proofErr w:type="spellStart"/>
-      <w:proofErr w:type="gramStart"/>
-      <w:r>
-        <w:rPr>
-          <w:rFonts w:ascii="Arial" w:hAnsi="Arial" w:cs="Arial"/>
-          <w:sz w:val="22"/>
-          <w:szCs w:val="22"/>
-        </w:rPr>
-        <w:t>Profesor:</w:t>
+        <w:t>Nombre Profesor:</w:t>
       </w:r>
       <w:r>
         <w:rPr>
@@ -116,19 +98,7 @@
           <w:sz w:val="22"/>
           <w:szCs w:val="22"/>
         </w:rPr>
-        <w:t>Yanina</w:t>
-      </w:r>
-      <w:proofErr w:type="spellEnd"/>
-      <w:proofErr w:type="gramEnd"/>
-      <w:r>
-        <w:rPr>
-          <w:rFonts w:ascii="Arial" w:hAnsi="Arial" w:cs="Arial"/>
-          <w:b/>
-          <w:bCs/>
-          <w:sz w:val="22"/>
-          <w:szCs w:val="22"/>
-        </w:rPr>
-        <w:t> Medina – Andrea Lezcano Airaldi - Matías Mascazzini</w:t>
+        <w:t>Yanina Medina – Andrea Lezcano Airaldi - Matías Mascazzini</w:t>
       </w:r>
     </w:p>
     <w:p>
@@ -172,7 +142,7 @@
           <w:sz w:val="22"/>
           <w:szCs w:val="22"/>
         </w:rPr>
-        <w:t>4</w:t>
+        <w:t>5</w:t>
       </w:r>
       <w:r>
         <w:rPr>
@@ -268,7 +238,6 @@
         </w:rPr>
         <w:t xml:space="preserve">Tema: Colecciones de objetos estáticas y </w:t>
       </w:r>
-      <w:proofErr w:type="spellStart"/>
       <w:r>
         <w:rPr>
           <w:rFonts w:ascii="Arial" w:hAnsi="Arial" w:cs="Arial"/>
@@ -285,7 +254,6 @@
         </w:rPr>
         <w:t>inamicas</w:t>
       </w:r>
-      <w:proofErr w:type="spellEnd"/>
     </w:p>
     <w:p>
       <w:pPr>
@@ -356,91 +324,15 @@
           <w:sz w:val="22"/>
           <w:szCs w:val="22"/>
         </w:rPr>
-        <w:t xml:space="preserve">Java </w:t>
-      </w:r>
-      <w:proofErr w:type="spellStart"/>
-      <w:r>
-        <w:rPr>
-          <w:rFonts w:ascii="Arial" w:hAnsi="Arial" w:cs="Arial"/>
-          <w:i/>
-          <w:iCs/>
-          <w:sz w:val="22"/>
-          <w:szCs w:val="22"/>
-        </w:rPr>
-        <w:t>Collections</w:t>
-      </w:r>
-      <w:proofErr w:type="spellEnd"/>
-      <w:r>
-        <w:rPr>
-          <w:rFonts w:ascii="Arial" w:hAnsi="Arial" w:cs="Arial"/>
-          <w:i/>
-          <w:iCs/>
-          <w:sz w:val="22"/>
-          <w:szCs w:val="22"/>
-        </w:rPr>
-        <w:t xml:space="preserve"> Framework</w:t>
-      </w:r>
-      <w:r>
-        <w:rPr>
-          <w:rFonts w:ascii="Arial" w:hAnsi="Arial" w:cs="Arial"/>
-          <w:sz w:val="22"/>
-          <w:szCs w:val="22"/>
-        </w:rPr>
-        <w:t xml:space="preserve"> (</w:t>
-      </w:r>
-      <w:proofErr w:type="spellStart"/>
-      <w:r>
-        <w:rPr>
-          <w:rFonts w:ascii="Arial" w:hAnsi="Arial" w:cs="Arial"/>
-          <w:sz w:val="22"/>
-          <w:szCs w:val="22"/>
-        </w:rPr>
-        <w:t>ArrayList</w:t>
-      </w:r>
-      <w:proofErr w:type="spellEnd"/>
-      <w:r>
-        <w:rPr>
-          <w:rFonts w:ascii="Arial" w:hAnsi="Arial" w:cs="Arial"/>
-          <w:sz w:val="22"/>
-          <w:szCs w:val="22"/>
-        </w:rPr>
-        <w:t xml:space="preserve">, </w:t>
-      </w:r>
-      <w:proofErr w:type="spellStart"/>
-      <w:r>
-        <w:rPr>
-          <w:rFonts w:ascii="Arial" w:hAnsi="Arial" w:cs="Arial"/>
-          <w:sz w:val="22"/>
-          <w:szCs w:val="22"/>
-        </w:rPr>
-        <w:t>HashSet</w:t>
-      </w:r>
-      <w:proofErr w:type="spellEnd"/>
-      <w:r>
-        <w:rPr>
-          <w:rFonts w:ascii="Arial" w:hAnsi="Arial" w:cs="Arial"/>
-          <w:sz w:val="22"/>
-          <w:szCs w:val="22"/>
-        </w:rPr>
-        <w:t xml:space="preserve"> y </w:t>
-      </w:r>
-      <w:proofErr w:type="spellStart"/>
-      <w:r>
-        <w:rPr>
-          <w:rFonts w:ascii="Arial" w:hAnsi="Arial" w:cs="Arial"/>
-          <w:sz w:val="22"/>
-          <w:szCs w:val="22"/>
-        </w:rPr>
-        <w:t>HashMap</w:t>
-      </w:r>
-      <w:proofErr w:type="spellEnd"/>
-      <w:r>
-        <w:rPr>
-          <w:rFonts w:ascii="Arial" w:hAnsi="Arial" w:cs="Arial"/>
-          <w:sz w:val="22"/>
-          <w:szCs w:val="22"/>
-        </w:rPr>
-        <w:t>). Asimismo, el práctico exige aplicar la reutilización de clases modeladas previamente (Punto, Producto, Cliente, Empleado, Persona, Localidad), reforzando el concepto de modularidad en la programación orientada a objetos</w:t>
+        <w:t>Java Collections Framework</w:t>
+      </w:r>
+      <w:r>
+        <w:rPr>
+          <w:rFonts w:ascii="Arial" w:hAnsi="Arial" w:cs="Arial"/>
+          <w:sz w:val="22"/>
+          <w:szCs w:val="22"/>
+        </w:rPr>
+        <w:t xml:space="preserve"> (ArrayList, HashSet y HashMap). Asimismo, el práctico exige aplicar la reutilización de clases modeladas previamente (Punto, Producto, Cliente, Empleado, Persona, Localidad), reforzando el concepto de modularidad en la programación orientada a objetos</w:t>
       </w:r>
     </w:p>
     <w:p>
@@ -496,132 +388,40 @@
         </w:rPr>
         <w:t xml:space="preserve">Para el primer </w:t>
       </w:r>
-      <w:proofErr w:type="spellStart"/>
-      <w:r>
-        <w:rPr>
-          <w:rFonts w:ascii="Arial" w:hAnsi="Arial" w:cs="Arial"/>
-          <w:sz w:val="22"/>
-          <w:szCs w:val="22"/>
-        </w:rPr>
-        <w:t>ejecicio</w:t>
-      </w:r>
-      <w:proofErr w:type="spellEnd"/>
-      <w:r>
-        <w:rPr>
-          <w:rFonts w:ascii="Arial" w:hAnsi="Arial" w:cs="Arial"/>
-          <w:sz w:val="22"/>
-          <w:szCs w:val="22"/>
-        </w:rPr>
-        <w:t xml:space="preserve"> (Array de Puntos)</w:t>
-      </w:r>
-      <w:r>
-        <w:rPr>
-          <w:rFonts w:ascii="Arial" w:hAnsi="Arial" w:cs="Arial"/>
-          <w:sz w:val="22"/>
-          <w:szCs w:val="22"/>
-        </w:rPr>
-        <w:t xml:space="preserve"> se </w:t>
-      </w:r>
-      <w:proofErr w:type="spellStart"/>
-      <w:r>
-        <w:rPr>
-          <w:rFonts w:ascii="Arial" w:hAnsi="Arial" w:cs="Arial"/>
-          <w:sz w:val="22"/>
-          <w:szCs w:val="22"/>
-        </w:rPr>
-        <w:t>implemento</w:t>
-      </w:r>
-      <w:proofErr w:type="spellEnd"/>
-      <w:r>
-        <w:rPr>
-          <w:rFonts w:ascii="Arial" w:hAnsi="Arial" w:cs="Arial"/>
-          <w:sz w:val="22"/>
-          <w:szCs w:val="22"/>
-        </w:rPr>
-        <w:t xml:space="preserve"> </w:t>
-      </w:r>
-      <w:proofErr w:type="gramStart"/>
-      <w:r>
-        <w:rPr>
-          <w:rFonts w:ascii="Arial" w:hAnsi="Arial" w:cs="Arial"/>
-          <w:sz w:val="22"/>
-          <w:szCs w:val="22"/>
-        </w:rPr>
-        <w:t>una  colección</w:t>
-      </w:r>
-      <w:proofErr w:type="gramEnd"/>
-      <w:r>
-        <w:rPr>
-          <w:rFonts w:ascii="Arial" w:hAnsi="Arial" w:cs="Arial"/>
-          <w:sz w:val="22"/>
-          <w:szCs w:val="22"/>
-        </w:rPr>
-        <w:t xml:space="preserve"> (o contenedor) de tipo </w:t>
-      </w:r>
-      <w:proofErr w:type="spellStart"/>
-      <w:r>
-        <w:rPr>
-          <w:rFonts w:ascii="Arial" w:hAnsi="Arial" w:cs="Arial"/>
-          <w:sz w:val="22"/>
-          <w:szCs w:val="22"/>
-        </w:rPr>
-        <w:t>estatico</w:t>
-      </w:r>
-      <w:proofErr w:type="spellEnd"/>
-      <w:r>
-        <w:rPr>
-          <w:rFonts w:ascii="Arial" w:hAnsi="Arial" w:cs="Arial"/>
-          <w:sz w:val="22"/>
-          <w:szCs w:val="22"/>
-        </w:rPr>
-        <w:t xml:space="preserve"> y homogénea</w:t>
-      </w:r>
-    </w:p>
-    <w:p>
-      <w:pPr>
-        <w:spacing w:after="0" w:line="240" w:lineRule="auto"/>
-        <w:rPr>
-          <w:rFonts w:ascii="Arial" w:hAnsi="Arial" w:cs="Arial"/>
-          <w:sz w:val="22"/>
-          <w:szCs w:val="22"/>
-        </w:rPr>
-      </w:pPr>
-      <w:r>
-        <w:rPr>
-          <w:rFonts w:ascii="Arial" w:hAnsi="Arial" w:cs="Arial"/>
-          <w:sz w:val="22"/>
-          <w:szCs w:val="22"/>
-        </w:rPr>
-        <w:t xml:space="preserve">Mas precisamente un contenedor de tipo Punto con espacio para objetos de tipo punto es decir contenedor </w:t>
-      </w:r>
-      <w:proofErr w:type="spellStart"/>
-      <w:r>
-        <w:rPr>
-          <w:rFonts w:ascii="Arial" w:hAnsi="Arial" w:cs="Arial"/>
-          <w:sz w:val="22"/>
-          <w:szCs w:val="22"/>
-        </w:rPr>
-        <w:t>homogeneo</w:t>
-      </w:r>
-      <w:proofErr w:type="spellEnd"/>
-      <w:r>
-        <w:rPr>
-          <w:rFonts w:ascii="Arial" w:hAnsi="Arial" w:cs="Arial"/>
-          <w:sz w:val="22"/>
-          <w:szCs w:val="22"/>
-        </w:rPr>
-        <w:t xml:space="preserve"> de tipo </w:t>
-      </w:r>
-      <w:proofErr w:type="spellStart"/>
-      <w:r>
-        <w:rPr>
-          <w:rFonts w:ascii="Arial" w:hAnsi="Arial" w:cs="Arial"/>
-          <w:sz w:val="22"/>
-          <w:szCs w:val="22"/>
-        </w:rPr>
-        <w:t>estatico</w:t>
-      </w:r>
-      <w:proofErr w:type="spellEnd"/>
+      <w:r>
+        <w:rPr>
+          <w:rFonts w:ascii="Arial" w:hAnsi="Arial" w:cs="Arial"/>
+          <w:sz w:val="22"/>
+          <w:szCs w:val="22"/>
+        </w:rPr>
+        <w:t>ejecicio (Array de Puntos)</w:t>
+      </w:r>
+      <w:r>
+        <w:rPr>
+          <w:rFonts w:ascii="Arial" w:hAnsi="Arial" w:cs="Arial"/>
+          <w:sz w:val="22"/>
+          <w:szCs w:val="22"/>
+        </w:rPr>
+        <w:t xml:space="preserve"> se implemento una  colección (o contenedor) de tipo estatico y homogénea</w:t>
+      </w:r>
+    </w:p>
+    <w:p>
+      <w:pPr>
+        <w:spacing w:after="0" w:line="240" w:lineRule="auto"/>
+        <w:rPr>
+          <w:rFonts w:ascii="Arial" w:hAnsi="Arial" w:cs="Arial"/>
+          <w:sz w:val="22"/>
+          <w:szCs w:val="22"/>
+        </w:rPr>
+      </w:pPr>
+      <w:r>
+        <w:rPr>
+          <w:rFonts w:ascii="Arial" w:hAnsi="Arial" w:cs="Arial"/>
+          <w:sz w:val="22"/>
+          <w:szCs w:val="22"/>
+        </w:rPr>
+        <w:t>Mas precisamente un contenedor de tipo Punto con espacio para objetos de tipo punto es decir contenedor homogeneo de tipo estatico</w:t>
+      </w:r>
       <w:r>
         <w:rPr>
           <w:rFonts w:ascii="Arial" w:hAnsi="Arial" w:cs="Arial"/>
@@ -768,9 +568,26 @@
           <w:sz w:val="22"/>
           <w:szCs w:val="22"/>
         </w:rPr>
-        <w:t>Implementación de una Lista Homogénea Dinámica (</w:t>
-      </w:r>
-      <w:proofErr w:type="spellStart"/>
+        <w:t>Implementación de una Lista Homogénea Dinámica (ArrayList)</w:t>
+      </w:r>
+    </w:p>
+    <w:p>
+      <w:pPr>
+        <w:spacing w:after="0" w:line="240" w:lineRule="auto"/>
+        <w:rPr>
+          <w:rFonts w:ascii="Arial" w:hAnsi="Arial" w:cs="Arial"/>
+          <w:sz w:val="22"/>
+          <w:szCs w:val="22"/>
+        </w:rPr>
+      </w:pPr>
+      <w:r>
+        <w:rPr>
+          <w:rFonts w:ascii="Arial" w:hAnsi="Arial" w:cs="Arial"/>
+          <w:sz w:val="22"/>
+          <w:szCs w:val="22"/>
+        </w:rPr>
+        <w:t xml:space="preserve">En Java, un </w:t>
+      </w:r>
       <w:r>
         <w:rPr>
           <w:rFonts w:ascii="Arial" w:hAnsi="Arial" w:cs="Arial"/>
@@ -781,47 +598,6 @@
         </w:rPr>
         <w:t>ArrayList</w:t>
       </w:r>
-      <w:proofErr w:type="spellEnd"/>
-      <w:r>
-        <w:rPr>
-          <w:rFonts w:ascii="Arial" w:hAnsi="Arial" w:cs="Arial"/>
-          <w:b/>
-          <w:bCs/>
-          <w:sz w:val="22"/>
-          <w:szCs w:val="22"/>
-        </w:rPr>
-        <w:t>)</w:t>
-      </w:r>
-    </w:p>
-    <w:p>
-      <w:pPr>
-        <w:spacing w:after="0" w:line="240" w:lineRule="auto"/>
-        <w:rPr>
-          <w:rFonts w:ascii="Arial" w:hAnsi="Arial" w:cs="Arial"/>
-          <w:sz w:val="22"/>
-          <w:szCs w:val="22"/>
-        </w:rPr>
-      </w:pPr>
-      <w:r>
-        <w:rPr>
-          <w:rFonts w:ascii="Arial" w:hAnsi="Arial" w:cs="Arial"/>
-          <w:sz w:val="22"/>
-          <w:szCs w:val="22"/>
-        </w:rPr>
-        <w:t xml:space="preserve">En Java, un </w:t>
-      </w:r>
-      <w:proofErr w:type="spellStart"/>
-      <w:r>
-        <w:rPr>
-          <w:rFonts w:ascii="Arial" w:hAnsi="Arial" w:cs="Arial"/>
-          <w:b/>
-          <w:bCs/>
-          <w:sz w:val="22"/>
-          <w:szCs w:val="22"/>
-        </w:rPr>
-        <w:t>ArrayList</w:t>
-      </w:r>
-      <w:proofErr w:type="spellEnd"/>
       <w:r>
         <w:rPr>
           <w:rFonts w:ascii="Arial" w:hAnsi="Arial" w:cs="Arial"/>
@@ -878,81 +654,7 @@
           <w:sz w:val="22"/>
           <w:szCs w:val="22"/>
         </w:rPr>
-        <w:t xml:space="preserve"> A diferencia de un arreglo convencional (como </w:t>
-      </w:r>
-      <w:proofErr w:type="gramStart"/>
-      <w:r>
-        <w:rPr>
-          <w:rFonts w:ascii="Arial" w:hAnsi="Arial" w:cs="Arial"/>
-          <w:sz w:val="22"/>
-          <w:szCs w:val="22"/>
-        </w:rPr>
-        <w:t>Punto[</w:t>
-      </w:r>
-      <w:proofErr w:type="gramEnd"/>
-      <w:r>
-        <w:rPr>
-          <w:rFonts w:ascii="Arial" w:hAnsi="Arial" w:cs="Arial"/>
-          <w:sz w:val="22"/>
-          <w:szCs w:val="22"/>
-        </w:rPr>
-        <w:t xml:space="preserve">]), su tamaño no es fijo. Puede crecer o reducirse en tiempo de ejecución a medida que se agregan o quitan elementos mediante métodos </w:t>
-      </w:r>
-      <w:proofErr w:type="gramStart"/>
-      <w:r>
-        <w:rPr>
-          <w:rFonts w:ascii="Arial" w:hAnsi="Arial" w:cs="Arial"/>
-          <w:sz w:val="22"/>
-          <w:szCs w:val="22"/>
-        </w:rPr>
-        <w:t>como .</w:t>
-      </w:r>
-      <w:proofErr w:type="spellStart"/>
-      <w:r>
-        <w:rPr>
-          <w:rFonts w:ascii="Arial" w:hAnsi="Arial" w:cs="Arial"/>
-          <w:sz w:val="22"/>
-          <w:szCs w:val="22"/>
-        </w:rPr>
-        <w:t>add</w:t>
-      </w:r>
-      <w:proofErr w:type="spellEnd"/>
-      <w:proofErr w:type="gramEnd"/>
-      <w:r>
-        <w:rPr>
-          <w:rFonts w:ascii="Arial" w:hAnsi="Arial" w:cs="Arial"/>
-          <w:sz w:val="22"/>
-          <w:szCs w:val="22"/>
-        </w:rPr>
-        <w:t xml:space="preserve">() </w:t>
-      </w:r>
-      <w:proofErr w:type="gramStart"/>
-      <w:r>
-        <w:rPr>
-          <w:rFonts w:ascii="Arial" w:hAnsi="Arial" w:cs="Arial"/>
-          <w:sz w:val="22"/>
-          <w:szCs w:val="22"/>
-        </w:rPr>
-        <w:t>y .</w:t>
-      </w:r>
-      <w:proofErr w:type="spellStart"/>
-      <w:r>
-        <w:rPr>
-          <w:rFonts w:ascii="Arial" w:hAnsi="Arial" w:cs="Arial"/>
-          <w:sz w:val="22"/>
-          <w:szCs w:val="22"/>
-        </w:rPr>
-        <w:t>remove</w:t>
-      </w:r>
-      <w:proofErr w:type="spellEnd"/>
-      <w:proofErr w:type="gramEnd"/>
-      <w:r>
-        <w:rPr>
-          <w:rFonts w:ascii="Arial" w:hAnsi="Arial" w:cs="Arial"/>
-          <w:sz w:val="22"/>
-          <w:szCs w:val="22"/>
-        </w:rPr>
-        <w:t>().</w:t>
+        <w:t xml:space="preserve"> A diferencia de un arreglo convencional (como Punto[]), su tamaño no es fijo. Puede crecer o reducirse en tiempo de ejecución a medida que se agregan o quitan elementos mediante métodos como .add() y .remove().</w:t>
       </w:r>
     </w:p>
     <w:p>
@@ -984,25 +686,7 @@
           <w:sz w:val="22"/>
           <w:szCs w:val="22"/>
         </w:rPr>
-        <w:t xml:space="preserve"> Aunque internamente gestiona los elementos como </w:t>
-      </w:r>
-      <w:proofErr w:type="spellStart"/>
-      <w:r>
-        <w:rPr>
-          <w:rFonts w:ascii="Arial" w:hAnsi="Arial" w:cs="Arial"/>
-          <w:sz w:val="22"/>
-          <w:szCs w:val="22"/>
-        </w:rPr>
-        <w:t>Object</w:t>
-      </w:r>
-      <w:proofErr w:type="spellEnd"/>
-      <w:r>
-        <w:rPr>
-          <w:rFonts w:ascii="Arial" w:hAnsi="Arial" w:cs="Arial"/>
-          <w:sz w:val="22"/>
-          <w:szCs w:val="22"/>
-        </w:rPr>
-        <w:t>, está concebida para almacenar objetos de un mismo tipo conceptual (en este caso, objetos de la clase Producto).</w:t>
+        <w:t xml:space="preserve"> Aunque internamente gestiona los elementos como Object, está concebida para almacenar objetos de un mismo tipo conceptual (en este caso, objetos de la clase Producto).</w:t>
       </w:r>
     </w:p>
     <w:p>
@@ -1085,25 +769,7 @@
           <w:sz w:val="22"/>
           <w:szCs w:val="22"/>
         </w:rPr>
-        <w:t xml:space="preserve">Métodos para manipular el array </w:t>
-      </w:r>
-      <w:proofErr w:type="spellStart"/>
-      <w:r>
-        <w:rPr>
-          <w:rFonts w:ascii="Arial" w:hAnsi="Arial" w:cs="Arial"/>
-          <w:sz w:val="22"/>
-          <w:szCs w:val="22"/>
-        </w:rPr>
-        <w:t>list</w:t>
-      </w:r>
-      <w:proofErr w:type="spellEnd"/>
-      <w:r>
-        <w:rPr>
-          <w:rFonts w:ascii="Arial" w:hAnsi="Arial" w:cs="Arial"/>
-          <w:sz w:val="22"/>
-          <w:szCs w:val="22"/>
-        </w:rPr>
-        <w:t>:</w:t>
+        <w:t>Métodos para manipular el array list:</w:t>
       </w:r>
     </w:p>
     <w:p>
@@ -1271,43 +937,7 @@
           <w:sz w:val="22"/>
           <w:szCs w:val="22"/>
         </w:rPr>
-        <w:t xml:space="preserve">Implementación de un hash </w:t>
-      </w:r>
-      <w:proofErr w:type="spellStart"/>
-      <w:r>
-        <w:rPr>
-          <w:rFonts w:ascii="Arial" w:hAnsi="Arial" w:cs="Arial"/>
-          <w:sz w:val="22"/>
-          <w:szCs w:val="22"/>
-        </w:rPr>
-        <w:t>map</w:t>
-      </w:r>
-      <w:proofErr w:type="spellEnd"/>
-      <w:r>
-        <w:rPr>
-          <w:rFonts w:ascii="Arial" w:hAnsi="Arial" w:cs="Arial"/>
-          <w:sz w:val="22"/>
-          <w:szCs w:val="22"/>
-        </w:rPr>
-        <w:t xml:space="preserve"> estructura para almacenar pares clave valor indexando el valor en base al hash </w:t>
-      </w:r>
-      <w:proofErr w:type="spellStart"/>
-      <w:r>
-        <w:rPr>
-          <w:rFonts w:ascii="Arial" w:hAnsi="Arial" w:cs="Arial"/>
-          <w:sz w:val="22"/>
-          <w:szCs w:val="22"/>
-        </w:rPr>
-        <w:t>code</w:t>
-      </w:r>
-      <w:proofErr w:type="spellEnd"/>
-      <w:r>
-        <w:rPr>
-          <w:rFonts w:ascii="Arial" w:hAnsi="Arial" w:cs="Arial"/>
-          <w:sz w:val="22"/>
-          <w:szCs w:val="22"/>
-        </w:rPr>
-        <w:t xml:space="preserve"> de su clave.</w:t>
+        <w:t>Implementación de un hash map estructura para almacenar pares clave valor indexando el valor en base al hash code de su clave.</w:t>
       </w:r>
       <w:r>
         <w:rPr>
@@ -1466,54 +1096,146 @@
           <w:szCs w:val="22"/>
         </w:rPr>
         <w:tab/>
-        <w:t xml:space="preserve">Este trabajo practico numero 4 profundo en temas nuevos (colecciones o contenedores) como se diferencian entre estáticos o dinámicos, homogéneos o heterogéneos y también </w:t>
-      </w:r>
-      <w:proofErr w:type="gramStart"/>
-      <w:r>
-        <w:rPr>
-          <w:rFonts w:ascii="Arial" w:hAnsi="Arial" w:cs="Arial"/>
-          <w:sz w:val="22"/>
-          <w:szCs w:val="22"/>
-        </w:rPr>
-        <w:t>su  aplicación</w:t>
-      </w:r>
-      <w:proofErr w:type="gramEnd"/>
-      <w:r>
-        <w:rPr>
-          <w:rFonts w:ascii="Arial" w:hAnsi="Arial" w:cs="Arial"/>
-          <w:sz w:val="22"/>
-          <w:szCs w:val="22"/>
-        </w:rPr>
-        <w:t xml:space="preserve"> mostrándonos junto con la interacción entre clases y objetos </w:t>
-      </w:r>
-      <w:proofErr w:type="spellStart"/>
-      <w:r>
-        <w:rPr>
-          <w:rFonts w:ascii="Arial" w:hAnsi="Arial" w:cs="Arial"/>
-          <w:sz w:val="22"/>
-          <w:szCs w:val="22"/>
-        </w:rPr>
-        <w:t>como</w:t>
-      </w:r>
-      <w:proofErr w:type="spellEnd"/>
-      <w:r>
-        <w:rPr>
-          <w:rFonts w:ascii="Arial" w:hAnsi="Arial" w:cs="Arial"/>
-          <w:sz w:val="22"/>
-          <w:szCs w:val="22"/>
-        </w:rPr>
-        <w:t xml:space="preserve"> funciona.</w:t>
-      </w:r>
-    </w:p>
-    <w:p>
-      <w:pPr>
-        <w:spacing w:after="0" w:line="240" w:lineRule="auto"/>
-        <w:rPr>
-          <w:rFonts w:ascii="Arial" w:hAnsi="Arial" w:cs="Arial"/>
-          <w:sz w:val="22"/>
-          <w:szCs w:val="22"/>
-        </w:rPr>
-      </w:pPr>
+        <w:t>Este trabajo practico numero 4 profundo en temas nuevos (colecciones o contenedores) como se diferencian entre estáticos o dinámicos, homogéneos o heterogéneos y también su  aplicación mostrándonos junto con la interacción entre clases y objetos como funciona.</w:t>
+      </w:r>
+    </w:p>
+    <w:p>
+      <w:pPr>
+        <w:spacing w:after="0" w:line="240" w:lineRule="auto"/>
+        <w:rPr>
+          <w:rFonts w:ascii="Arial" w:hAnsi="Arial" w:cs="Arial"/>
+          <w:sz w:val="22"/>
+          <w:szCs w:val="22"/>
+        </w:rPr>
+      </w:pPr>
+      <w:r>
+        <w:rPr>
+          <w:rFonts w:ascii="Arial" w:hAnsi="Arial" w:cs="Arial"/>
+          <w:sz w:val="22"/>
+          <w:szCs w:val="22"/>
+        </w:rPr>
+        <w:t>Asi mas o menos se toma el coloquio para este tp</w:t>
+      </w:r>
+    </w:p>
+    <w:p>
+      <w:pPr>
+        <w:spacing w:after="0" w:line="240" w:lineRule="auto"/>
+        <w:rPr>
+          <w:rFonts w:ascii="Arial" w:hAnsi="Arial" w:cs="Arial"/>
+          <w:sz w:val="22"/>
+          <w:szCs w:val="22"/>
+        </w:rPr>
+      </w:pPr>
+    </w:p>
+    <w:p>
+      <w:pPr>
+        <w:spacing w:after="0" w:line="240" w:lineRule="auto"/>
+        <w:rPr>
+          <w:rFonts w:ascii="Arial" w:hAnsi="Arial" w:cs="Arial"/>
+          <w:sz w:val="22"/>
+          <w:szCs w:val="22"/>
+        </w:rPr>
+      </w:pPr>
+      <w:r>
+        <w:rPr>
+          <w:rFonts w:ascii="Arial" w:hAnsi="Arial" w:cs="Arial"/>
+          <w:sz w:val="22"/>
+          <w:szCs w:val="22"/>
+        </w:rPr>
+        <w:t>En este tp dimos tal y tal tema y definimos después damos ejemplos</w:t>
+      </w:r>
+    </w:p>
+    <w:p>
+      <w:pPr>
+        <w:spacing w:after="0" w:line="240" w:lineRule="auto"/>
+        <w:rPr>
+          <w:rFonts w:ascii="Arial" w:hAnsi="Arial" w:cs="Arial"/>
+          <w:sz w:val="22"/>
+          <w:szCs w:val="22"/>
+        </w:rPr>
+      </w:pPr>
+    </w:p>
+    <w:p>
+      <w:pPr>
+        <w:spacing w:after="0" w:line="240" w:lineRule="auto"/>
+        <w:rPr>
+          <w:rFonts w:ascii="Arial" w:hAnsi="Arial" w:cs="Arial"/>
+          <w:sz w:val="22"/>
+          <w:szCs w:val="22"/>
+        </w:rPr>
+      </w:pPr>
+      <w:r>
+        <w:rPr>
+          <w:rFonts w:ascii="Arial" w:hAnsi="Arial" w:cs="Arial"/>
+          <w:sz w:val="22"/>
+          <w:szCs w:val="22"/>
+        </w:rPr>
+        <w:t>Herencia y polimorfimso</w:t>
+      </w:r>
+    </w:p>
+    <w:p>
+      <w:pPr>
+        <w:spacing w:after="0" w:line="240" w:lineRule="auto"/>
+        <w:rPr>
+          <w:rFonts w:ascii="Arial" w:hAnsi="Arial" w:cs="Arial"/>
+          <w:sz w:val="22"/>
+          <w:szCs w:val="22"/>
+        </w:rPr>
+      </w:pPr>
+    </w:p>
+    <w:p>
+      <w:pPr>
+        <w:spacing w:after="0" w:line="240" w:lineRule="auto"/>
+        <w:rPr>
+          <w:rFonts w:ascii="Arial" w:hAnsi="Arial" w:cs="Arial"/>
+          <w:sz w:val="22"/>
+          <w:szCs w:val="22"/>
+        </w:rPr>
+      </w:pPr>
+      <w:r>
+        <w:rPr>
+          <w:rFonts w:ascii="Arial" w:hAnsi="Arial" w:cs="Arial"/>
+          <w:sz w:val="22"/>
+          <w:szCs w:val="22"/>
+        </w:rPr>
+        <w:t>Clases abstractas</w:t>
+      </w:r>
+    </w:p>
+    <w:p>
+      <w:pPr>
+        <w:spacing w:after="0" w:line="240" w:lineRule="auto"/>
+        <w:rPr>
+          <w:rFonts w:ascii="Arial" w:hAnsi="Arial" w:cs="Arial"/>
+          <w:sz w:val="22"/>
+          <w:szCs w:val="22"/>
+        </w:rPr>
+      </w:pPr>
+      <w:r>
+        <w:rPr>
+          <w:rFonts w:ascii="Arial" w:hAnsi="Arial" w:cs="Arial"/>
+          <w:sz w:val="22"/>
+          <w:szCs w:val="22"/>
+        </w:rPr>
+        <w:t>Saber quien es super y quien es this,</w:t>
+      </w:r>
+    </w:p>
+    <w:p>
+      <w:pPr>
+        <w:spacing w:after="0" w:line="240" w:lineRule="auto"/>
+        <w:rPr>
+          <w:rFonts w:ascii="Arial" w:hAnsi="Arial" w:cs="Arial"/>
+          <w:sz w:val="22"/>
+          <w:szCs w:val="22"/>
+        </w:rPr>
+      </w:pPr>
+      <w:r>
+        <w:rPr>
+          <w:rFonts w:ascii="Arial" w:hAnsi="Arial" w:cs="Arial"/>
+          <w:sz w:val="22"/>
+          <w:szCs w:val="22"/>
+        </w:rPr>
+        <w:t>Por cada cosa ejemplo de codigo</w:t>
+      </w:r>
     </w:p>
     <w:sectPr>
       <w:pgSz w:w="11906" w:h="16838"/>
@@ -2437,6 +2159,7 @@
   <w:style w:type="character" w:default="1" w:styleId="Fuentedeprrafopredeter">
     <w:name w:val="Default Paragraph Font"/>
     <w:uiPriority w:val="1"/>
+    <w:semiHidden/>
     <w:unhideWhenUsed/>
   </w:style>
   <w:style w:type="table" w:default="1" w:styleId="Tablanormal">

</xml_diff>